<commit_message>
Proseguimento del manuale tecnico
</commit_message>
<xml_diff>
--- a/Progettazione/Manuale tecnico.docx
+++ b/Progettazione/Manuale tecnico.docx
@@ -344,6 +344,8 @@
                                   <w:spacing w:before="40" w:after="40"/>
                                   <w:rPr>
                                     <w:rStyle w:val="Enfasigrassetto"/>
+                                    <w:b w:val="0"/>
+                                    <w:bCs w:val="0"/>
                                     <w:sz w:val="24"/>
                                     <w:szCs w:val="24"/>
                                   </w:rPr>
@@ -352,6 +354,8 @@
                                 <w:r>
                                   <w:rPr>
                                     <w:rStyle w:val="Enfasigrassetto"/>
+                                    <w:b w:val="0"/>
+                                    <w:bCs w:val="0"/>
                                     <w:sz w:val="24"/>
                                     <w:szCs w:val="24"/>
                                   </w:rPr>
@@ -361,6 +365,8 @@
                                 <w:r>
                                   <w:rPr>
                                     <w:rStyle w:val="Enfasigrassetto"/>
+                                    <w:b w:val="0"/>
+                                    <w:bCs w:val="0"/>
                                     <w:sz w:val="24"/>
                                     <w:szCs w:val="24"/>
                                   </w:rPr>
@@ -377,6 +383,8 @@
                                   <w:spacing w:before="40" w:after="40"/>
                                   <w:rPr>
                                     <w:rStyle w:val="Enfasigrassetto"/>
+                                    <w:b w:val="0"/>
+                                    <w:bCs w:val="0"/>
                                     <w:sz w:val="24"/>
                                     <w:szCs w:val="24"/>
                                   </w:rPr>
@@ -384,6 +392,8 @@
                                 <w:r>
                                   <w:rPr>
                                     <w:rStyle w:val="Enfasigrassetto"/>
+                                    <w:b w:val="0"/>
+                                    <w:bCs w:val="0"/>
                                     <w:sz w:val="24"/>
                                     <w:szCs w:val="24"/>
                                   </w:rPr>
@@ -400,6 +410,8 @@
                                   <w:spacing w:before="40" w:after="40"/>
                                   <w:rPr>
                                     <w:rStyle w:val="Enfasigrassetto"/>
+                                    <w:b w:val="0"/>
+                                    <w:bCs w:val="0"/>
                                     <w:sz w:val="24"/>
                                     <w:szCs w:val="24"/>
                                   </w:rPr>
@@ -407,6 +419,8 @@
                                 <w:r>
                                   <w:rPr>
                                     <w:rStyle w:val="Enfasigrassetto"/>
+                                    <w:b w:val="0"/>
+                                    <w:bCs w:val="0"/>
                                     <w:sz w:val="24"/>
                                     <w:szCs w:val="24"/>
                                   </w:rPr>
@@ -423,6 +437,8 @@
                                   <w:spacing w:before="40" w:after="40"/>
                                   <w:rPr>
                                     <w:rStyle w:val="Enfasigrassetto"/>
+                                    <w:b w:val="0"/>
+                                    <w:bCs w:val="0"/>
                                     <w:sz w:val="24"/>
                                     <w:szCs w:val="24"/>
                                   </w:rPr>
@@ -430,6 +446,8 @@
                                 <w:r>
                                   <w:rPr>
                                     <w:rStyle w:val="Enfasigrassetto"/>
+                                    <w:b w:val="0"/>
+                                    <w:bCs w:val="0"/>
                                     <w:sz w:val="24"/>
                                     <w:szCs w:val="24"/>
                                   </w:rPr>
@@ -521,6 +539,8 @@
                             <w:spacing w:before="40" w:after="40"/>
                             <w:rPr>
                               <w:rStyle w:val="Enfasigrassetto"/>
+                              <w:b w:val="0"/>
+                              <w:bCs w:val="0"/>
                               <w:sz w:val="24"/>
                               <w:szCs w:val="24"/>
                             </w:rPr>
@@ -529,6 +549,8 @@
                           <w:r>
                             <w:rPr>
                               <w:rStyle w:val="Enfasigrassetto"/>
+                              <w:b w:val="0"/>
+                              <w:bCs w:val="0"/>
                               <w:sz w:val="24"/>
                               <w:szCs w:val="24"/>
                             </w:rPr>
@@ -538,6 +560,8 @@
                           <w:r>
                             <w:rPr>
                               <w:rStyle w:val="Enfasigrassetto"/>
+                              <w:b w:val="0"/>
+                              <w:bCs w:val="0"/>
                               <w:sz w:val="24"/>
                               <w:szCs w:val="24"/>
                             </w:rPr>
@@ -554,6 +578,8 @@
                             <w:spacing w:before="40" w:after="40"/>
                             <w:rPr>
                               <w:rStyle w:val="Enfasigrassetto"/>
+                              <w:b w:val="0"/>
+                              <w:bCs w:val="0"/>
                               <w:sz w:val="24"/>
                               <w:szCs w:val="24"/>
                             </w:rPr>
@@ -561,6 +587,8 @@
                           <w:r>
                             <w:rPr>
                               <w:rStyle w:val="Enfasigrassetto"/>
+                              <w:b w:val="0"/>
+                              <w:bCs w:val="0"/>
                               <w:sz w:val="24"/>
                               <w:szCs w:val="24"/>
                             </w:rPr>
@@ -577,6 +605,8 @@
                             <w:spacing w:before="40" w:after="40"/>
                             <w:rPr>
                               <w:rStyle w:val="Enfasigrassetto"/>
+                              <w:b w:val="0"/>
+                              <w:bCs w:val="0"/>
                               <w:sz w:val="24"/>
                               <w:szCs w:val="24"/>
                             </w:rPr>
@@ -584,6 +614,8 @@
                           <w:r>
                             <w:rPr>
                               <w:rStyle w:val="Enfasigrassetto"/>
+                              <w:b w:val="0"/>
+                              <w:bCs w:val="0"/>
                               <w:sz w:val="24"/>
                               <w:szCs w:val="24"/>
                             </w:rPr>
@@ -600,6 +632,8 @@
                             <w:spacing w:before="40" w:after="40"/>
                             <w:rPr>
                               <w:rStyle w:val="Enfasigrassetto"/>
+                              <w:b w:val="0"/>
+                              <w:bCs w:val="0"/>
                               <w:sz w:val="24"/>
                               <w:szCs w:val="24"/>
                             </w:rPr>
@@ -607,6 +641,8 @@
                           <w:r>
                             <w:rPr>
                               <w:rStyle w:val="Enfasigrassetto"/>
+                              <w:b w:val="0"/>
+                              <w:bCs w:val="0"/>
                               <w:sz w:val="24"/>
                               <w:szCs w:val="24"/>
                             </w:rPr>
@@ -2083,12 +2119,142 @@
     </w:p>
     <w:p>
       <w:pPr>
-        <w:ind w:left="360"/>
-        <w:rPr>
-          <w:b/>
-          <w:bCs/>
-          <w:sz w:val="40"/>
-          <w:szCs w:val="40"/>
+        <w:rPr>
+          <w:sz w:val="28"/>
+          <w:szCs w:val="28"/>
+        </w:rPr>
+      </w:pPr>
+      <w:r>
+        <w:rPr>
+          <w:sz w:val="28"/>
+          <w:szCs w:val="28"/>
+        </w:rPr>
+        <w:t>Il sistema è organizzato in tre moduli:</w:t>
+      </w:r>
+    </w:p>
+    <w:p>
+      <w:pPr>
+        <w:pStyle w:val="Paragrafoelenco"/>
+        <w:numPr>
+          <w:ilvl w:val="0"/>
+          <w:numId w:val="7"/>
+        </w:numPr>
+        <w:rPr>
+          <w:i/>
+          <w:iCs/>
+          <w:sz w:val="28"/>
+          <w:szCs w:val="28"/>
+        </w:rPr>
+      </w:pPr>
+      <w:proofErr w:type="spellStart"/>
+      <w:r>
+        <w:rPr>
+          <w:i/>
+          <w:iCs/>
+          <w:sz w:val="28"/>
+          <w:szCs w:val="28"/>
+        </w:rPr>
+        <w:t>theknife</w:t>
+      </w:r>
+      <w:proofErr w:type="spellEnd"/>
+      <w:r>
+        <w:rPr>
+          <w:i/>
+          <w:iCs/>
+          <w:sz w:val="28"/>
+          <w:szCs w:val="28"/>
+        </w:rPr>
+        <w:t>-common</w:t>
+      </w:r>
+    </w:p>
+    <w:p>
+      <w:pPr>
+        <w:pStyle w:val="Paragrafoelenco"/>
+        <w:numPr>
+          <w:ilvl w:val="0"/>
+          <w:numId w:val="7"/>
+        </w:numPr>
+        <w:rPr>
+          <w:i/>
+          <w:iCs/>
+          <w:sz w:val="28"/>
+          <w:szCs w:val="28"/>
+        </w:rPr>
+      </w:pPr>
+      <w:proofErr w:type="spellStart"/>
+      <w:r>
+        <w:rPr>
+          <w:i/>
+          <w:iCs/>
+          <w:sz w:val="28"/>
+          <w:szCs w:val="28"/>
+        </w:rPr>
+        <w:t>theknife</w:t>
+      </w:r>
+      <w:proofErr w:type="spellEnd"/>
+      <w:r>
+        <w:rPr>
+          <w:i/>
+          <w:iCs/>
+          <w:sz w:val="28"/>
+          <w:szCs w:val="28"/>
+        </w:rPr>
+        <w:t>-client</w:t>
+      </w:r>
+    </w:p>
+    <w:p>
+      <w:pPr>
+        <w:pStyle w:val="Paragrafoelenco"/>
+        <w:numPr>
+          <w:ilvl w:val="0"/>
+          <w:numId w:val="7"/>
+        </w:numPr>
+        <w:rPr>
+          <w:i/>
+          <w:iCs/>
+          <w:sz w:val="28"/>
+          <w:szCs w:val="28"/>
+        </w:rPr>
+      </w:pPr>
+      <w:proofErr w:type="spellStart"/>
+      <w:r>
+        <w:rPr>
+          <w:i/>
+          <w:iCs/>
+          <w:sz w:val="28"/>
+          <w:szCs w:val="28"/>
+        </w:rPr>
+        <w:t>theknife</w:t>
+      </w:r>
+      <w:proofErr w:type="spellEnd"/>
+      <w:r>
+        <w:rPr>
+          <w:i/>
+          <w:iCs/>
+          <w:sz w:val="28"/>
+          <w:szCs w:val="28"/>
+        </w:rPr>
+        <w:t>-server</w:t>
+      </w:r>
+    </w:p>
+    <w:p>
+      <w:pPr>
+        <w:rPr>
+          <w:i/>
+          <w:iCs/>
+          <w:sz w:val="28"/>
+          <w:szCs w:val="28"/>
+        </w:rPr>
+      </w:pPr>
+    </w:p>
+    <w:p>
+      <w:pPr>
+        <w:rPr>
+          <w:b/>
+          <w:bCs/>
+          <w:sz w:val="40"/>
+          <w:szCs w:val="40"/>
+          <w:u w:val="single"/>
         </w:rPr>
       </w:pPr>
     </w:p>
@@ -2293,6 +2459,7 @@
           <w:sz w:val="40"/>
           <w:szCs w:val="40"/>
         </w:rPr>
+        <w:lastRenderedPageBreak/>
         <w:t>Gestione delle sessioni</w:t>
       </w:r>
     </w:p>
@@ -2346,7 +2513,6 @@
           <w:sz w:val="40"/>
           <w:szCs w:val="40"/>
         </w:rPr>
-        <w:lastRenderedPageBreak/>
         <w:t>Modulo common</w:t>
       </w:r>
     </w:p>
@@ -2688,7 +2854,6 @@
           <w:sz w:val="40"/>
           <w:szCs w:val="40"/>
         </w:rPr>
-        <w:lastRenderedPageBreak/>
         <w:t>Gestione</w:t>
       </w:r>
       <w:r>

</xml_diff>

<commit_message>
Aggiornamento del class diagram nel manuale tecnico
</commit_message>
<xml_diff>
--- a/Progettazione/Manuale tecnico.docx
+++ b/Progettazione/Manuale tecnico.docx
@@ -3669,7 +3669,15 @@
               <w:bCs/>
               <w:lang w:eastAsia="it-IT"/>
             </w:rPr>
-            <w:t>Sitografia</w:t>
+            <w:t>Bibliografia e s</w:t>
+          </w:r>
+          <w:r>
+            <w:rPr>
+              <w:b/>
+              <w:bCs/>
+              <w:lang w:eastAsia="it-IT"/>
+            </w:rPr>
+            <w:t>itografia</w:t>
           </w:r>
         </w:p>
       </w:sdtContent>
@@ -9732,10 +9740,10 @@
           <w:noProof/>
         </w:rPr>
         <w:drawing>
-          <wp:inline distT="0" distB="0" distL="0" distR="0" wp14:anchorId="04541C50" wp14:editId="427B4BFA">
-            <wp:extent cx="4975515" cy="6598920"/>
+          <wp:inline distT="0" distB="0" distL="0" distR="0" wp14:anchorId="02AA9EE7" wp14:editId="09DB41B5">
+            <wp:extent cx="4846320" cy="6427571"/>
             <wp:effectExtent l="0" t="0" r="0" b="0"/>
-            <wp:docPr id="1260464025" name="Immagine 7"/>
+            <wp:docPr id="125842249" name="Immagine 7"/>
             <wp:cNvGraphicFramePr>
               <a:graphicFrameLocks xmlns:a="http://schemas.openxmlformats.org/drawingml/2006/main" noChangeAspect="1"/>
             </wp:cNvGraphicFramePr>
@@ -9743,7 +9751,7 @@
               <a:graphicData uri="http://schemas.openxmlformats.org/drawingml/2006/picture">
                 <pic:pic xmlns:pic="http://schemas.openxmlformats.org/drawingml/2006/picture">
                   <pic:nvPicPr>
-                    <pic:cNvPr id="1260464025" name="Immagine 1260464025"/>
+                    <pic:cNvPr id="125842249" name="Immagine 125842249"/>
                     <pic:cNvPicPr/>
                   </pic:nvPicPr>
                   <pic:blipFill>
@@ -9761,7 +9769,7 @@
                   <pic:spPr>
                     <a:xfrm>
                       <a:off x="0" y="0"/>
-                      <a:ext cx="4992408" cy="6621325"/>
+                      <a:ext cx="4855075" cy="6439183"/>
                     </a:xfrm>
                     <a:prstGeom prst="rect">
                       <a:avLst/>
@@ -9796,6 +9804,17 @@
         <w:t>diagram</w:t>
       </w:r>
       <w:proofErr w:type="spellEnd"/>
+    </w:p>
+    <w:p>
+      <w:pPr>
+        <w:jc w:val="both"/>
+        <w:rPr>
+          <w:b/>
+          <w:bCs/>
+          <w:sz w:val="52"/>
+          <w:szCs w:val="52"/>
+        </w:rPr>
+      </w:pPr>
     </w:p>
     <w:p>
       <w:pPr>
@@ -53096,7 +53115,16 @@
           <w:szCs w:val="52"/>
         </w:rPr>
         <w:lastRenderedPageBreak/>
-        <w:t>Sitografia</w:t>
+        <w:t>Bibliografia e s</w:t>
+      </w:r>
+      <w:r>
+        <w:rPr>
+          <w:b/>
+          <w:bCs/>
+          <w:sz w:val="52"/>
+          <w:szCs w:val="52"/>
+        </w:rPr>
+        <w:t>itografia</w:t>
       </w:r>
     </w:p>
     <w:p>

</xml_diff>

<commit_message>
Modifiche dopo test di simulazione
</commit_message>
<xml_diff>
--- a/Progettazione/Manuale tecnico.docx
+++ b/Progettazione/Manuale tecnico.docx
@@ -42948,15 +42948,15 @@
           <w:rFonts w:ascii="Consolas" w:hAnsi="Consolas"/>
           <w:sz w:val="20"/>
         </w:rPr>
-        <w:t>mvn initialize -Pdb-setup -Ddb.admin.user=&lt;utente admin PostgreSQL&gt; -Ddb.admin.password=&lt;password&gt;</w:t>
-      </w:r>
-    </w:p>
-    <w:p>
-      <w:r>
-        <w:rPr>
-          <w:sz w:val="28"/>
-        </w:rPr>
-        <w:t>Il comando crea il ruolo applicativo tk_app, il database dbTK, le tabelle e carica il dataset del docente, eseguendo nell'ordine gli script Role.sql, Schema.sql e Data.sql, descritti sotto. L'utente admin deve poter creare ruoli e database (es. l'utente “postgres” creato dall'installazione di PostgreSQL). Se PostgreSQL non è in ascolto su localhost:5432, aggiungere -Ddb.host=&lt;host&gt; e/o -Ddb.port=&lt;porta&gt;.</w:t>
+        <w:t>mvn initialize -Pdb-setup -Ddb.admin.user=postgres -Ddb.admin.password=miapassword</w:t>
+      </w:r>
+    </w:p>
+    <w:p>
+      <w:r>
+        <w:rPr>
+          <w:sz w:val="28"/>
+        </w:rPr>
+        <w:t>Il comando crea il ruolo applicativo tk_app, il database dbTK, le tabelle e carica il dataset del docente, eseguendo nell'ordine gli script Role.sql, Schema.sql e Data.sql, descritti sotto. postgres e miapassword vanno sostituiti con utente e password reali di un amministratore PostgreSQL (i valori dell'esempio non vanno copiati così come sono). Se PostgreSQL non è in ascolto su localhost:5432, aggiungere al comando -Ddb.host=NOMEHOST e/o -Ddb.port=NUMEROPORTA, sempre con i valori reali al posto dei segnaposto.</w:t>
       </w:r>
     </w:p>
     <w:p>

</xml_diff>